<commit_message>
Markdown: lift a body look and pass over an unused body style only from prose
The body look and spacing are read, and a Body Text or First Paragraph
without text is passed over, only from top-level paragraphs of 40
characters or more (PROSE_CHARS): letterhead and label lines no longer
drive the body style. A template whose only text is two short lines kept
its Body Text definition in production but exported a "Template Body
Text" lifted from one of them. Shorter lines still count as text for the
"used" check.

Two fixtures relied on sample lines under 40 characters being prose and
were given longer ones (unused-body-text-style.docx, and
html-converted-template.docx through its generator); their tests assert
the same outcomes. The e2e repro body-text-no-prose.docx is a fixture.
</commit_message>
<xml_diff>
--- a/tests/fixtures/markdown/html-converted-template.docx
+++ b/tests/fixtures/markdown/html-converted-template.docx
@@ -63,7 +63,7 @@
           <w:sz w:val="20"/>
           <w:szCs w:val="20"/>
         </w:rPr>
-        <w:t xml:space="preserve">Unstyled sample text one.</w:t>
+        <w:t xml:space="preserve">Unstyled sample text one, long enough to read as the prose of the advice.</w:t>
       </w:r>
     </w:p>
     <w:p>
@@ -74,7 +74,7 @@
           <w:sz w:val="20"/>
           <w:szCs w:val="20"/>
         </w:rPr>
-        <w:t xml:space="preserve">Unstyled sample text two.</w:t>
+        <w:t xml:space="preserve">Unstyled sample text two, long enough to read as the prose of the advice.</w:t>
       </w:r>
     </w:p>
     <w:p>
@@ -85,7 +85,7 @@
           <w:sz w:val="20"/>
           <w:szCs w:val="20"/>
         </w:rPr>
-        <w:t xml:space="preserve">Unstyled sample text three.</w:t>
+        <w:t xml:space="preserve">Unstyled sample text three, long enough to read as the prose of the advice.</w:t>
       </w:r>
     </w:p>
     <w:p>

</xml_diff>